<commit_message>
toBe(true) vs toBeTruthy in playwright
</commit_message>
<xml_diff>
--- a/ReferenceMaterials/cart.docx
+++ b/ReferenceMaterials/cart.docx
@@ -185,6 +185,11 @@
       </w:r>
     </w:p>
     <w:p/>
+    <w:p>
+      <w:r>
+        <w:t>T</w:t>
+      </w:r>
+    </w:p>
     <w:p>
       <w:r>
         <w:t>Made changes.</w:t>

</xml_diff>